<commit_message>
thesis: apply 8 targeted critique edits to local docx (not yet pushed) + transcript exchange 4
</commit_message>
<xml_diff>
--- a/thesis/003_ThesisProposal (4).docx
+++ b/thesis/003_ThesisProposal (4).docx
@@ -1594,13 +1594,17 @@
         <w:jc w:val="both"/>
       </w:pPr>
       <w:r>
-        <w:rPr>
-          <w:rFonts w:ascii="Georgia" w:hAnsi="Georgia" w:eastAsia="Georgia"/>
-          <w:b w:val="0"/>
-          <w:i w:val="0"/>
-          <w:sz w:val="22"/>
-        </w:rPr>
-        <w:t>English language proficiency is not measured as a variable in this design. The study therefore makes no causal claims regarding why specific patterns appear; it operates strictly as a descriptive mapping of what patterns exist. Reliability was assessed through intra-rater agreement only. A second coder was not available for inter-rater reliability testing, which limits the extent to which the coding scheme can be verified against an independent application of the same decision rules.</w:t>
+        <w:t>Reliability was assessed through intra-rater agreement only. A second coder was not available for inter-rater reliability testing, which limits the extent to which the coding scheme can be verified against an independent application of the same decision rules. This limitation particularly affects the functional findings reported in Part III. The uniform assignment of all 60 hedges to the Epistemic Caution function may reflect a single coder's interpretive frame rather than a property of the corpus itself. Future research with inter-rater coding on at least a subset of the corpus is needed to test the robustness of the functional findings before they can be treated as established.</w:t>
+      </w:r>
+    </w:p>
+    <w:p>
+      <w:pPr>
+        <w:spacing w:line="480" w:lineRule="auto" w:before="0" w:after="0"/>
+        <w:ind w:firstLine="720"/>
+        <w:jc w:val="both"/>
+      </w:pPr>
+      <w:r>
+        <w:t>The study also lacks a comparable expert-abstract corpus against which to compare the functional findings. The absence of interactional hedges (Politeness, Discourse Organization) in this corpus may reflect genre compression in abstracts rather than writer deficit. Expert abstracts in the same three disciplines, coded with the same scheme, would allow the study to distinguish genre effects from writer-competence effects. Future research with such a comparison corpus is needed before the functional narrowness reported here can be attributed to writer characteristics rather than to genre constraints.</w:t>
       </w:r>
     </w:p>
     <w:p>
@@ -5711,13 +5715,7 @@
         <w:jc w:val="both"/>
       </w:pPr>
       <w:r>
-        <w:rPr>
-          <w:rFonts w:ascii="Georgia" w:hAnsi="Georgia" w:eastAsia="Georgia"/>
-          <w:b w:val="0"/>
-          <w:i w:val="0"/>
-          <w:sz w:val="22"/>
-        </w:rPr>
-        <w:t>The uniform assignment of EC is a notable finding. In Hyland’s (1998) expert corpus, hedges served multiple functions: epistemic caution dominated, but politeness markers (e.g., “as suggested by Hyland”) and discourse organizers (e.g., “it should be noted that”) also appeared. Their complete absence in this undergraduate corpus suggests that PSAU developing researchers use hedging exclusively to manage certainty about claims, not to manage social relations with readers or to structure their text.</w:t>
+        <w:t>The uniform assignment of EC is a notable finding, though it requires a caveat about coder reliability. In Hyland's (1998) expert corpus, hedges served multiple functions: epistemic caution dominated, but politeness markers (e.g., “as suggested by Hyland”) and discourse organizers (e.g., “it should be noted that”) also appeared. Their complete absence in this undergraduate corpus suggests that PSAU developing researchers use hedging exclusively to manage certainty about claims, not to manage social relations with readers or to structure their text. However, this functional uniformity must be interpreted in light of two limitations. First, reliability was assessed through intra-rater agreement only (κ = 0.89); without a second independent coder, it is not possible to determine whether the uniform EC assignment reflects the corpus itself or the application of a single interpretive frame. Second, as noted below, the abstract genre may itself suppress interactional functions regardless of writer sophistication. The functional finding is therefore reported as observed in this corpus, not as established.</w:t>
       </w:r>
     </w:p>
     <w:p>
@@ -5743,13 +5741,7 @@
         <w:jc w:val="both"/>
       </w:pPr>
       <w:r>
-        <w:rPr>
-          <w:rFonts w:ascii="Georgia" w:hAnsi="Georgia" w:eastAsia="Georgia"/>
-          <w:b w:val="0"/>
-          <w:i w:val="0"/>
-          <w:sz w:val="22"/>
-        </w:rPr>
-        <w:t>The absence of discourse organization hedges (e.g., “it should be noted that”) may also reflect the compressed nature of the abstract genre. In full-length papers, discourse organizers help readers navigate complex arguments. In abstracts, where space is severely limited, writers may omit these organizational markers in favor of direct content. This genre constraint could suppress the use of DO hedges regardless of the writer’s rhetorical awareness. Similarly, the absence of politeness hedges may be a genre effect rather than a writer deficit: if expert abstracts also use fewer interactional hedges than full papers, the pattern in this corpus may partly reflect genre norms rather than a lack of rhetorical sophistication. The present study cannot distinguish between these two explanations without a comparable expert-abstract corpus, but the genre-constraint interpretation is worth noting as a competing explanation for the functional narrowness observed.</w:t>
+        <w:t>The present study cannot distinguish between these two explanations without a comparable expert-abstract corpus, but the genre-constraint interpretation is worth noting as a competing explanation for the functional narrowness observed. Future research with a matched expert-abstract comparison corpus is needed to disentangle genre effects from writer-competence effects. Without such a comparison, the functional uniformity observed here should not be taken as evidence of writer deficit.</w:t>
       </w:r>
     </w:p>
     <w:p>
@@ -5792,13 +5784,7 @@
         <w:jc w:val="both"/>
       </w:pPr>
       <w:r>
-        <w:rPr>
-          <w:rFonts w:ascii="Georgia" w:hAnsi="Georgia" w:eastAsia="Georgia"/>
-          <w:b w:val="0"/>
-          <w:i w:val="0"/>
-          <w:sz w:val="22"/>
-        </w:rPr>
-        <w:t>The frequency and functional patterns identified in Parts I through III suggest three distinguishable hedging profiles across the disciplines, though the boundaries are not absolute and the statistical support is preliminary (Kruskal-Wallis p = .049; chi-square on zero-hedge distribution p = .13). The following labels are interpretive descriptions of observed patterns, not statistically established typologies. They are interpreted through the lens of Salager-Meyer’s (1994) claim-responsibility framework and Hyland’s (2005) stance model.</w:t>
+        <w:t>The frequency and functional patterns identified in Parts I through III reveal three observable patterns within this corpus. Given the small sample (n = 20 per discipline) and the borderline statistical support (Kruskal-Wallis p = .049; chi-square on zero-hedge distribution p = .13, which does not reach the conventional threshold of p &lt; .05), these patterns are exploratory observations rather than established typologies. The labels below describe what was observed in this corpus; they should not be read as stable discipline-level characteristics. Generalization beyond this corpus and beyond the three observed disciplines is not warranted. The patterns are interpreted through the lens of Salager-Meyer's (1994) claim-responsibility framework and Hyland's (2005) stance model.</w:t>
       </w:r>
     </w:p>
     <w:p>
@@ -5808,13 +5794,7 @@
         <w:jc w:val="both"/>
       </w:pPr>
       <w:r>
-        <w:rPr>
-          <w:rFonts w:ascii="Georgia" w:hAnsi="Georgia" w:eastAsia="Georgia"/>
-          <w:b w:val="0"/>
-          <w:i w:val="0"/>
-          <w:sz w:val="22"/>
-        </w:rPr>
-        <w:t>Agriculture: A pattern suggestive of cautious implication. Agriculture’s hedge density (0.60 per 100 words) is partly driven by a single outlier abstract (Acs2, 8 hedges); without it, Agriculture drops below Biology (0.44 vs. 0.55), making the Agriculture-Biology comparison marginal. The balanced use of modal verbs (14) and lexical hedges (12) suggest a pattern of cautious implication. Agricultural writers in this corpus frequently hedged their implications rather than their direct results. The token “potential” appeared 4 times, and “suggests” appeared 4 times, both typically in conclusion sentences where writers drew out the practical significance of their findings. This pattern reflects what Salager-Meyer (1994) describes as distributed claim responsibility: the writer presents the finding as settled (e.g., “results showed no significant difference”) but hedges the implication (e.g., “this suggests that Trichoderma and fermented azolla at proper application frequencies could be beneficial”). The finding is stated with certainty, while the application is hedged. This may reflect the practical orientation of agricultural research, where findings have direct implications for farming practices and economic outcomes.</w:t>
+        <w:t>Agriculture: An observed pattern suggestive of cautious implication, though outlier-dependent. Agriculture's hedge density (0.60 per 100 words) is partly driven by a single outlier abstract (Acs2, which alone contained 8 hedges). Without Acs2, Agriculture drops below Biology (0.44 vs. 0.55 per 100 words), making the Agriculture-Biology contrast marginal and not robust. The Agriculture-Biology difference is therefore better characterized as marginal and outlier-driven than as a stable disciplinary pattern. Within this caveat, the balanced use of modal verbs (14) and lexical hedges (12) in the observed data suggests a tendency toward cautious implication in this corpus. Agricultural writers in this corpus frequently hedged their implications rather than their direct results. The token “potential” appeared 4 times, and “suggests” appeared 4 times, both typically in conclusion sentences where writers drew out the practical significance of their findings. This pattern reflects what Salager-Meyer (1994) describes as distributed claim responsibility: the writer presents the finding as settled (e.g., “results showed no significant difference”) but hedges the implication (e.g., “this suggests that Trichoderma and fermented azolla at proper application frequencies could be beneficial”). The finding is stated with certainty, while the application is hedged. This may reflect the practical orientation of agricultural research, where findings have direct implications for farming practices and economic outcomes.</w:t>
       </w:r>
     </w:p>
     <w:p>
@@ -5904,13 +5884,17 @@
         <w:jc w:val="both"/>
       </w:pPr>
       <w:r>
-        <w:rPr>
-          <w:rFonts w:ascii="Georgia" w:hAnsi="Georgia" w:eastAsia="Georgia"/>
-          <w:b w:val="0"/>
-          <w:i w:val="0"/>
-          <w:sz w:val="22"/>
-        </w:rPr>
-        <w:t>Taken together, three patterns in the data suggest what may be described as pro forma hedging: the acquisition of hedge-like lexical items without the corresponding epistemic function. First, the token “potential” accounts for 38.9% of all lexical hedges and appears in nearly identical syntactic frames across multiple abstracts (“the potential of X as a Y,” “has potential as an X”), suggesting formulaic rather than epistemically motivated deployment. Second, the uniform assignment of all 60 hedges to the Epistemic Caution function, with zero instances of Politeness or Discourse Organization, indicates that writers are not making functional rhetorical choices but defaulting to a single hedge type. Third, the 46.7% zero-hedge rate shows that the majority of writers do not engage hedging at all. When hedging does appear, it often takes the form of a learned lexical shell rather than a calibrated stance marker. This pattern aligns with Demir’s (2018) finding that L2 writers underuse hedges for reasons that are partly linguistic, and Petchkij’s (2019) observation that explicit instruction can change lexical frequency but not always functional range. The term pro forma hedging is offered here not as an established construct but as a descriptive label for the gap between lexical acquisition and epistemic deployment that this corpus reveals.</w:t>
+        <w:t>Taken together, three patterns in the data are consistent with what may be described as pro forma hedging: the acquisition of hedge-like lexical items without the corresponding epistemic function. First, the token “potential” accounts for 38.9% of all lexical hedges and appears in nearly identical syntactic frames across multiple abstracts (“the potential of X as a Y,” “has potential as an X”), suggesting formulaic rather than epistemically motivated deployment. Second, the uniform assignment of all 60 hedges to the Epistemic Caution function, with zero instances of Politeness or Discourse Organization, indicates that writers are not making functional rhetorical choices but defaulting to a single hedge type. Third, the 46.7% zero-hedge rate shows that the majority of writers do not engage hedging at all. When hedging does appear, it often takes the form of a learned lexical shell rather than a calibrated stance marker. This pattern aligns with Demir's (2018) finding that L2 writers underuse hedges for reasons that are partly linguistic, and Petchkij's (2019) observation that explicit instruction can change lexical frequency but not always functional range.</w:t>
+      </w:r>
+    </w:p>
+    <w:p>
+      <w:pPr>
+        <w:spacing w:line="480" w:lineRule="auto" w:before="0" w:after="0"/>
+        <w:ind w:firstLine="720"/>
+        <w:jc w:val="both"/>
+      </w:pPr>
+      <w:r>
+        <w:t>The term pro forma hedging is offered here not as an established theoretical construct but as a descriptive label for an observed gap between lexical acquisition and epistemic deployment. The label is supported by three observations within a single corpus; it has not been validated through independent coding, comparison with an expert-abstract corpus, or replication in other L2 contexts. The label should therefore be read as a hypothesis-generating observation, not as a confirmed phenomenon. Subsequent research with inter-rater coding, an expert-abstract comparison corpus, and replication across institutions and disciplines would be needed before the term could be treated as a stable construct. Within the present study, the label serves a heuristic purpose: it identifies a pattern worth investigating, not a finding that has been established.</w:t>
       </w:r>
     </w:p>
     <w:p>
@@ -6109,13 +6093,7 @@
         <w:jc w:val="both"/>
       </w:pPr>
       <w:r>
-        <w:rPr>
-          <w:rFonts w:ascii="Georgia" w:hAnsi="Georgia" w:eastAsia="Georgia"/>
-          <w:b w:val="0"/>
-          <w:i w:val="0"/>
-          <w:sz w:val="22"/>
-        </w:rPr>
-        <w:t>The discipline-specific patterns suggest distinct epistemic stances. Agriculture exhibits cautious implication, hedging applications while stating findings as settled. Biology exhibits lexical caution with heavy reliance on “potential” and “suggesting,” much of which is non-epistemic (topic-naming in aim statements). Veterinary Medicine exhibits assertive reporting, with over half of its abstracts containing zero hedges and the highest count of unhedged assertion sites. These stances align with Salager-Meyer’s (1994) framework: each discipline creates distinct epistemic demands that shape how writers distribute claim responsibility, even at the undergraduate level.</w:t>
+        <w:t>The discipline-specific patterns observed in this corpus suggest differences in epistemic stance, though the statistical evidence is borderline (Kruskal-Wallis p = .049) and the Agriculture-Biology contrast is outlier-dependent. The most defensible contrast is Veterinary Medicine's distinct pattern: its 65% zero-hedge rate and 0.18 density are substantially different from both Agriculture and Biology. Agriculture shows a tendency toward cautious implication, hedging applications while stating findings as settled, though this is partly driven by a single outlier abstract (Acs2). Biology shows lexical caution with heavy reliance on “potential” and “suggesting,” much of which is non-epistemic (topic-naming in aim statements). Veterinary Medicine shows assertive reporting, with over half of its abstracts containing zero hedges and the highest count of unhedged assertion sites. Where these patterns hold, they are consistent with Salager-Meyer's (1994) framework: each discipline may create distinct epistemic demands that shape how writers distribute claim responsibility, even at the undergraduate level. Generalization beyond this corpus, however, is not warranted.</w:t>
       </w:r>
     </w:p>
     <w:p>

</xml_diff>